<commit_message>
docs(paper): docx 标题样式补全 - 11/16/26 三级层级
通过 python-docx 注册并套用 Word 标题样式（黑体 18/13/12pt 加粗+段前距），原 docx 引擎未将 HTML h1 映射到 Heading 1 导致 Word 自动目录无法收集；补 11 个 H1（摘要/ABSTRACT/4 章/总/参考/致谢/附录 A/图集）+ 15 H3（章内节）+ 26 H4（小节），自动大纲/目录可用
</commit_message>
<xml_diff>
--- a/docs/paper/艺培通课程设计报告.docx
+++ b/docs/paper/艺培通课程设计报告.docx
@@ -26,6 +26,7 @@
     </w:p>
     <w:p>
       <w:pPr>
+        <w:pStyle w:val="Heading1"/>
         <w:keepNext w:val="1"/>
         <w:keepLines w:val="1"/>
         <w:spacing w:before="100" w:beforeAutospacing="1" w:after="100" w:afterAutospacing="1"/>
@@ -85,6 +86,7 @@
     </w:p>
     <w:p>
       <w:pPr>
+        <w:pStyle w:val="Heading1"/>
         <w:keepNext w:val="1"/>
         <w:keepLines w:val="1"/>
         <w:spacing w:before="100" w:beforeAutospacing="1" w:after="100" w:afterAutospacing="1"/>
@@ -130,6 +132,7 @@
     </w:p>
     <w:p>
       <w:pPr>
+        <w:pStyle w:val="Heading1"/>
         <w:keepNext w:val="1"/>
         <w:keepLines w:val="1"/>
         <w:spacing w:before="100" w:beforeAutospacing="1" w:after="100" w:afterAutospacing="1"/>
@@ -151,6 +154,7 @@
     </w:p>
     <w:p>
       <w:pPr>
+        <w:pStyle w:val="Heading3"/>
         <w:keepNext w:val="1"/>
         <w:keepLines w:val="1"/>
         <w:spacing w:before="100" w:beforeAutospacing="1" w:after="100" w:afterAutospacing="1"/>
@@ -171,6 +175,7 @@
     </w:p>
     <w:p>
       <w:pPr>
+        <w:pStyle w:val="Heading4"/>
         <w:keepNext w:val="1"/>
         <w:keepLines w:val="1"/>
         <w:spacing w:before="100" w:beforeAutospacing="1" w:after="100" w:afterAutospacing="1"/>
@@ -199,6 +204,7 @@
     </w:p>
     <w:p>
       <w:pPr>
+        <w:pStyle w:val="Heading4"/>
         <w:keepNext w:val="1"/>
         <w:keepLines w:val="1"/>
         <w:spacing w:before="100" w:beforeAutospacing="1" w:after="100" w:afterAutospacing="1"/>
@@ -227,6 +233,7 @@
     </w:p>
     <w:p>
       <w:pPr>
+        <w:pStyle w:val="Heading4"/>
         <w:keepNext w:val="1"/>
         <w:keepLines w:val="1"/>
         <w:spacing w:before="100" w:beforeAutospacing="1" w:after="100" w:afterAutospacing="1"/>
@@ -255,6 +262,7 @@
     </w:p>
     <w:p>
       <w:pPr>
+        <w:pStyle w:val="Heading4"/>
         <w:keepNext w:val="1"/>
         <w:keepLines w:val="1"/>
         <w:spacing w:before="100" w:beforeAutospacing="1" w:after="100" w:afterAutospacing="1"/>
@@ -283,6 +291,7 @@
     </w:p>
     <w:p>
       <w:pPr>
+        <w:pStyle w:val="Heading4"/>
         <w:keepNext w:val="1"/>
         <w:keepLines w:val="1"/>
         <w:spacing w:before="100" w:beforeAutospacing="1" w:after="100" w:afterAutospacing="1"/>
@@ -311,6 +320,7 @@
     </w:p>
     <w:p>
       <w:pPr>
+        <w:pStyle w:val="Heading4"/>
         <w:keepNext w:val="1"/>
         <w:keepLines w:val="1"/>
         <w:spacing w:before="100" w:beforeAutospacing="1" w:after="100" w:afterAutospacing="1"/>
@@ -339,6 +349,7 @@
     </w:p>
     <w:p>
       <w:pPr>
+        <w:pStyle w:val="Heading3"/>
         <w:keepNext w:val="1"/>
         <w:keepLines w:val="1"/>
         <w:spacing w:before="100" w:beforeAutospacing="1" w:after="100" w:afterAutospacing="1"/>
@@ -570,6 +581,7 @@
     </w:p>
     <w:p>
       <w:pPr>
+        <w:pStyle w:val="Heading1"/>
         <w:keepNext w:val="1"/>
         <w:keepLines w:val="1"/>
         <w:spacing w:before="100" w:beforeAutospacing="1" w:after="100" w:afterAutospacing="1"/>
@@ -626,6 +638,7 @@
     </w:p>
     <w:p>
       <w:pPr>
+        <w:pStyle w:val="Heading3"/>
         <w:keepNext w:val="1"/>
         <w:keepLines w:val="1"/>
         <w:spacing w:before="100" w:beforeAutospacing="1" w:after="100" w:afterAutospacing="1"/>
@@ -1434,6 +1447,7 @@
     </w:p>
     <w:p>
       <w:pPr>
+        <w:pStyle w:val="Heading3"/>
         <w:keepNext w:val="1"/>
         <w:keepLines w:val="1"/>
         <w:spacing w:before="100" w:beforeAutospacing="1" w:after="100" w:afterAutospacing="1"/>
@@ -1454,6 +1468,7 @@
     </w:p>
     <w:p>
       <w:pPr>
+        <w:pStyle w:val="Heading4"/>
         <w:keepNext w:val="1"/>
         <w:keepLines w:val="1"/>
         <w:spacing w:before="100" w:beforeAutospacing="1" w:after="100" w:afterAutospacing="1"/>
@@ -1494,6 +1509,7 @@
     </w:p>
     <w:p>
       <w:pPr>
+        <w:pStyle w:val="Heading4"/>
         <w:keepNext w:val="1"/>
         <w:keepLines w:val="1"/>
         <w:spacing w:before="100" w:beforeAutospacing="1" w:after="100" w:afterAutospacing="1"/>
@@ -1534,6 +1550,7 @@
     </w:p>
     <w:p>
       <w:pPr>
+        <w:pStyle w:val="Heading4"/>
         <w:keepNext w:val="1"/>
         <w:keepLines w:val="1"/>
         <w:spacing w:before="100" w:beforeAutospacing="1" w:after="100" w:afterAutospacing="1"/>
@@ -1574,6 +1591,7 @@
     </w:p>
     <w:p>
       <w:pPr>
+        <w:pStyle w:val="Heading4"/>
         <w:keepNext w:val="1"/>
         <w:keepLines w:val="1"/>
         <w:spacing w:before="100" w:beforeAutospacing="1" w:after="100" w:afterAutospacing="1"/>
@@ -1614,6 +1632,7 @@
     </w:p>
     <w:p>
       <w:pPr>
+        <w:pStyle w:val="Heading4"/>
         <w:keepNext w:val="1"/>
         <w:keepLines w:val="1"/>
         <w:spacing w:before="100" w:beforeAutospacing="1" w:after="100" w:afterAutospacing="1"/>
@@ -1654,6 +1673,7 @@
     </w:p>
     <w:p>
       <w:pPr>
+        <w:pStyle w:val="Heading3"/>
         <w:keepNext w:val="1"/>
         <w:keepLines w:val="1"/>
         <w:spacing w:before="100" w:beforeAutospacing="1" w:after="100" w:afterAutospacing="1"/>
@@ -2108,6 +2128,7 @@
     </w:p>
     <w:p>
       <w:pPr>
+        <w:pStyle w:val="Heading1"/>
         <w:keepNext w:val="1"/>
         <w:keepLines w:val="1"/>
         <w:spacing w:before="100" w:beforeAutospacing="1" w:after="100" w:afterAutospacing="1"/>
@@ -2129,6 +2150,7 @@
     </w:p>
     <w:p>
       <w:pPr>
+        <w:pStyle w:val="Heading3"/>
         <w:keepNext w:val="1"/>
         <w:keepLines w:val="1"/>
         <w:spacing w:before="100" w:beforeAutospacing="1" w:after="100" w:afterAutospacing="1"/>
@@ -2149,6 +2171,7 @@
     </w:p>
     <w:p>
       <w:pPr>
+        <w:pStyle w:val="Heading4"/>
         <w:keepNext w:val="1"/>
         <w:keepLines w:val="1"/>
         <w:spacing w:before="100" w:beforeAutospacing="1" w:after="100" w:afterAutospacing="1"/>
@@ -2218,6 +2241,7 @@
     </w:p>
     <w:p>
       <w:pPr>
+        <w:pStyle w:val="Heading4"/>
         <w:keepNext w:val="1"/>
         <w:keepLines w:val="1"/>
         <w:spacing w:before="100" w:beforeAutospacing="1" w:after="100" w:afterAutospacing="1"/>
@@ -2278,6 +2302,7 @@
     </w:p>
     <w:p>
       <w:pPr>
+        <w:pStyle w:val="Heading3"/>
         <w:keepNext w:val="1"/>
         <w:keepLines w:val="1"/>
         <w:spacing w:before="100" w:beforeAutospacing="1" w:after="100" w:afterAutospacing="1"/>
@@ -2298,6 +2323,7 @@
     </w:p>
     <w:p>
       <w:pPr>
+        <w:pStyle w:val="Heading4"/>
         <w:keepNext w:val="1"/>
         <w:keepLines w:val="1"/>
         <w:spacing w:before="100" w:beforeAutospacing="1" w:after="100" w:afterAutospacing="1"/>
@@ -2358,6 +2384,7 @@
     </w:p>
     <w:p>
       <w:pPr>
+        <w:pStyle w:val="Heading4"/>
         <w:keepNext w:val="1"/>
         <w:keepLines w:val="1"/>
         <w:spacing w:before="100" w:beforeAutospacing="1" w:after="100" w:afterAutospacing="1"/>
@@ -2415,6 +2442,7 @@
     </w:p>
     <w:p>
       <w:pPr>
+        <w:pStyle w:val="Heading3"/>
         <w:keepNext w:val="1"/>
         <w:keepLines w:val="1"/>
         <w:spacing w:before="100" w:beforeAutospacing="1" w:after="100" w:afterAutospacing="1"/>
@@ -2435,6 +2463,7 @@
     </w:p>
     <w:p>
       <w:pPr>
+        <w:pStyle w:val="Heading4"/>
         <w:keepNext w:val="1"/>
         <w:keepLines w:val="1"/>
         <w:spacing w:before="100" w:beforeAutospacing="1" w:after="100" w:afterAutospacing="1"/>
@@ -2495,6 +2524,7 @@
     </w:p>
     <w:p>
       <w:pPr>
+        <w:pStyle w:val="Heading4"/>
         <w:keepNext w:val="1"/>
         <w:keepLines w:val="1"/>
         <w:spacing w:before="100" w:beforeAutospacing="1" w:after="100" w:afterAutospacing="1"/>
@@ -2555,6 +2585,7 @@
     </w:p>
     <w:p>
       <w:pPr>
+        <w:pStyle w:val="Heading3"/>
         <w:keepNext w:val="1"/>
         <w:keepLines w:val="1"/>
         <w:spacing w:before="100" w:beforeAutospacing="1" w:after="100" w:afterAutospacing="1"/>
@@ -2575,6 +2606,7 @@
     </w:p>
     <w:p>
       <w:pPr>
+        <w:pStyle w:val="Heading4"/>
         <w:keepNext w:val="1"/>
         <w:keepLines w:val="1"/>
         <w:spacing w:before="100" w:beforeAutospacing="1" w:after="100" w:afterAutospacing="1"/>
@@ -2623,6 +2655,7 @@
     </w:p>
     <w:p>
       <w:pPr>
+        <w:pStyle w:val="Heading4"/>
         <w:keepNext w:val="1"/>
         <w:keepLines w:val="1"/>
         <w:spacing w:before="100" w:beforeAutospacing="1" w:after="100" w:afterAutospacing="1"/>
@@ -2671,6 +2704,7 @@
     </w:p>
     <w:p>
       <w:pPr>
+        <w:pStyle w:val="Heading3"/>
         <w:keepNext w:val="1"/>
         <w:keepLines w:val="1"/>
         <w:spacing w:before="100" w:beforeAutospacing="1" w:after="100" w:afterAutospacing="1"/>
@@ -2691,6 +2725,7 @@
     </w:p>
     <w:p>
       <w:pPr>
+        <w:pStyle w:val="Heading4"/>
         <w:keepNext w:val="1"/>
         <w:keepLines w:val="1"/>
         <w:spacing w:before="100" w:beforeAutospacing="1" w:after="100" w:afterAutospacing="1"/>
@@ -2727,6 +2762,7 @@
     </w:p>
     <w:p>
       <w:pPr>
+        <w:pStyle w:val="Heading4"/>
         <w:keepNext w:val="1"/>
         <w:keepLines w:val="1"/>
         <w:spacing w:before="100" w:beforeAutospacing="1" w:after="100" w:afterAutospacing="1"/>
@@ -2767,6 +2803,7 @@
     </w:p>
     <w:p>
       <w:pPr>
+        <w:pStyle w:val="Heading3"/>
         <w:keepNext w:val="1"/>
         <w:keepLines w:val="1"/>
         <w:spacing w:before="100" w:beforeAutospacing="1" w:after="100" w:afterAutospacing="1"/>
@@ -2787,6 +2824,7 @@
     </w:p>
     <w:p>
       <w:pPr>
+        <w:pStyle w:val="Heading4"/>
         <w:keepNext w:val="1"/>
         <w:keepLines w:val="1"/>
         <w:spacing w:before="100" w:beforeAutospacing="1" w:after="100" w:afterAutospacing="1"/>
@@ -2835,6 +2873,7 @@
     </w:p>
     <w:p>
       <w:pPr>
+        <w:pStyle w:val="Heading4"/>
         <w:keepNext w:val="1"/>
         <w:keepLines w:val="1"/>
         <w:spacing w:before="100" w:beforeAutospacing="1" w:after="100" w:afterAutospacing="1"/>
@@ -2930,6 +2969,7 @@
     </w:p>
     <w:p>
       <w:pPr>
+        <w:pStyle w:val="Heading1"/>
         <w:keepNext w:val="1"/>
         <w:keepLines w:val="1"/>
         <w:spacing w:before="100" w:beforeAutospacing="1" w:after="100" w:afterAutospacing="1"/>
@@ -2951,6 +2991,7 @@
     </w:p>
     <w:p>
       <w:pPr>
+        <w:pStyle w:val="Heading3"/>
         <w:keepNext w:val="1"/>
         <w:keepLines w:val="1"/>
         <w:spacing w:before="100" w:beforeAutospacing="1" w:after="100" w:afterAutospacing="1"/>
@@ -3197,6 +3238,7 @@
     </w:p>
     <w:p>
       <w:pPr>
+        <w:pStyle w:val="Heading3"/>
         <w:keepNext w:val="1"/>
         <w:keepLines w:val="1"/>
         <w:spacing w:before="100" w:beforeAutospacing="1" w:after="100" w:afterAutospacing="1"/>
@@ -4541,6 +4583,7 @@
     </w:tbl>
     <w:p>
       <w:pPr>
+        <w:pStyle w:val="Heading3"/>
         <w:keepNext w:val="1"/>
         <w:keepLines w:val="1"/>
         <w:spacing w:before="100" w:beforeAutospacing="1" w:after="100" w:afterAutospacing="1"/>
@@ -4561,6 +4604,7 @@
     </w:p>
     <w:p>
       <w:pPr>
+        <w:pStyle w:val="Heading4"/>
         <w:keepNext w:val="1"/>
         <w:keepLines w:val="1"/>
         <w:spacing w:before="100" w:beforeAutospacing="1" w:after="100" w:afterAutospacing="1"/>
@@ -4589,6 +4633,7 @@
     </w:p>
     <w:p>
       <w:pPr>
+        <w:pStyle w:val="Heading4"/>
         <w:keepNext w:val="1"/>
         <w:keepLines w:val="1"/>
         <w:spacing w:before="100" w:beforeAutospacing="1" w:after="100" w:afterAutospacing="1"/>
@@ -4617,6 +4662,7 @@
     </w:p>
     <w:p>
       <w:pPr>
+        <w:pStyle w:val="Heading4"/>
         <w:keepNext w:val="1"/>
         <w:keepLines w:val="1"/>
         <w:spacing w:before="100" w:beforeAutospacing="1" w:after="100" w:afterAutospacing="1"/>
@@ -4645,6 +4691,7 @@
     </w:p>
     <w:p>
       <w:pPr>
+        <w:pStyle w:val="Heading3"/>
         <w:keepNext w:val="1"/>
         <w:keepLines w:val="1"/>
         <w:spacing w:before="100" w:beforeAutospacing="1" w:after="100" w:afterAutospacing="1"/>
@@ -5039,6 +5086,7 @@
     </w:p>
     <w:p>
       <w:pPr>
+        <w:pStyle w:val="Heading1"/>
         <w:keepNext w:val="1"/>
         <w:keepLines w:val="1"/>
         <w:spacing w:before="100" w:beforeAutospacing="1" w:after="100" w:afterAutospacing="1"/>
@@ -5084,6 +5132,7 @@
     </w:p>
     <w:p>
       <w:pPr>
+        <w:pStyle w:val="Heading1"/>
         <w:keepNext w:val="1"/>
         <w:keepLines w:val="1"/>
         <w:spacing w:before="100" w:beforeAutospacing="1" w:after="100" w:afterAutospacing="1"/>
@@ -5169,6 +5218,7 @@
     </w:p>
     <w:p>
       <w:pPr>
+        <w:pStyle w:val="Heading1"/>
         <w:keepNext w:val="1"/>
         <w:keepLines w:val="1"/>
         <w:spacing w:before="100" w:beforeAutospacing="1" w:after="100" w:afterAutospacing="1"/>
@@ -5236,6 +5286,7 @@
     </w:p>
     <w:p>
       <w:pPr>
+        <w:pStyle w:val="Heading1"/>
         <w:keepNext w:val="1"/>
         <w:keepLines w:val="1"/>
         <w:spacing w:before="100" w:beforeAutospacing="1" w:after="100" w:afterAutospacing="1"/>
@@ -6802,6 +6853,7 @@
     </w:p>
     <w:p>
       <w:pPr>
+        <w:pStyle w:val="Heading1"/>
         <w:keepNext w:val="1"/>
         <w:keepLines w:val="1"/>
         <w:spacing w:before="100" w:beforeAutospacing="1" w:after="100" w:afterAutospacing="1"/>
@@ -8000,7 +8052,52 @@
 </file>
 
 <file path=word/styles.xml><?xml version="1.0" encoding="utf-8"?>
-<w:styles xmlns:w="http://schemas.openxmlformats.org/wordprocessingml/2006/main"/>
+<w:styles xmlns:w="http://schemas.openxmlformats.org/wordprocessingml/2006/main">
+  <w:style w:type="paragraph" w:customStyle="1" w:styleId="Heading1">
+    <w:name w:val="heading 1"/>
+    <w:pPr>
+      <w:spacing w:before="360" w:after="200"/>
+    </w:pPr>
+    <w:rPr>
+      <w:rFonts w:ascii="黑体" w:hAnsi="黑体"/>
+      <w:b/>
+      <w:sz w:val="36"/>
+    </w:rPr>
+  </w:style>
+  <w:style w:type="paragraph" w:customStyle="1" w:styleId="Heading2">
+    <w:name w:val="heading 2"/>
+    <w:pPr>
+      <w:spacing w:before="280" w:after="160"/>
+    </w:pPr>
+    <w:rPr>
+      <w:rFonts w:ascii="黑体" w:hAnsi="黑体"/>
+      <w:b/>
+      <w:sz w:val="30"/>
+    </w:rPr>
+  </w:style>
+  <w:style w:type="paragraph" w:customStyle="1" w:styleId="Heading3">
+    <w:name w:val="heading 3"/>
+    <w:pPr>
+      <w:spacing w:before="200" w:after="120"/>
+    </w:pPr>
+    <w:rPr>
+      <w:rFonts w:ascii="黑体" w:hAnsi="黑体"/>
+      <w:b/>
+      <w:sz w:val="26"/>
+    </w:rPr>
+  </w:style>
+  <w:style w:type="paragraph" w:customStyle="1" w:styleId="Heading4">
+    <w:name w:val="heading 4"/>
+    <w:pPr>
+      <w:spacing w:before="160" w:after="80"/>
+    </w:pPr>
+    <w:rPr>
+      <w:rFonts w:ascii="黑体" w:hAnsi="黑体"/>
+      <w:b/>
+      <w:sz w:val="24"/>
+    </w:rPr>
+  </w:style>
+</w:styles>
 </file>
 
 <file path=word/theme/theme1.xml><?xml version="1.0" encoding="utf-8"?>

</xml_diff>